<commit_message>
Añadido comienzo de la parte opcional
</commit_message>
<xml_diff>
--- a/Opcional/Gramatica.docx
+++ b/Opcional/Gramatica.docx
@@ -12,7 +12,49 @@
         <w:rPr>
           <w:lang w:val="en-GB"/>
         </w:rPr>
-        <w:t>P1 -&gt; pg id ; Dl C1 Sl e pg id SP1l</w:t>
+        <w:t xml:space="preserve">P1 -&gt; </w:t>
+      </w:r>
+      <w:proofErr w:type="spellStart"/>
+      <w:r>
+        <w:rPr>
+          <w:lang w:val="en-GB"/>
+        </w:rPr>
+        <w:t>pg</w:t>
+      </w:r>
+      <w:proofErr w:type="spellEnd"/>
+      <w:r>
+        <w:rPr>
+          <w:lang w:val="en-GB"/>
+        </w:rPr>
+        <w:t xml:space="preserve"> id ; Dl C1 </w:t>
+      </w:r>
+      <w:proofErr w:type="spellStart"/>
+      <w:r>
+        <w:rPr>
+          <w:lang w:val="en-GB"/>
+        </w:rPr>
+        <w:t>Sl</w:t>
+      </w:r>
+      <w:proofErr w:type="spellEnd"/>
+      <w:r>
+        <w:rPr>
+          <w:lang w:val="en-GB"/>
+        </w:rPr>
+        <w:t xml:space="preserve"> e </w:t>
+      </w:r>
+      <w:proofErr w:type="spellStart"/>
+      <w:r>
+        <w:rPr>
+          <w:lang w:val="en-GB"/>
+        </w:rPr>
+        <w:t>pg</w:t>
+      </w:r>
+      <w:proofErr w:type="spellEnd"/>
+      <w:r>
+        <w:rPr>
+          <w:lang w:val="en-GB"/>
+        </w:rPr>
+        <w:t xml:space="preserve"> id SP1l</w:t>
       </w:r>
     </w:p>
     <w:p>
@@ -73,48 +115,106 @@
           <w:lang w:val="en-GB"/>
         </w:rPr>
       </w:pPr>
-      <w:r>
-        <w:rPr>
-          <w:lang w:val="en-GB"/>
-        </w:rPr>
-        <w:t>Sl -&gt; S S´</w:t>
-      </w:r>
-    </w:p>
-    <w:p>
-      <w:pPr>
-        <w:rPr>
-          <w:lang w:val="en-GB"/>
-        </w:rPr>
-      </w:pPr>
-      <w:r>
-        <w:rPr>
-          <w:lang w:val="en-GB"/>
-        </w:rPr>
-        <w:t>S´ -&gt; ! | S S´</w:t>
-      </w:r>
-    </w:p>
-    <w:p>
-      <w:pPr>
-        <w:rPr>
-          <w:lang w:val="en-GB"/>
-        </w:rPr>
-      </w:pPr>
-    </w:p>
-    <w:p>
-      <w:pPr>
-        <w:rPr>
-          <w:lang w:val="en-GB"/>
-        </w:rPr>
-      </w:pPr>
-      <w:r>
-        <w:rPr>
-          <w:lang w:val="en-GB"/>
-        </w:rPr>
-        <w:t>D -&gt; ',' pr :: id = SV C2l ; Dl | :: Vl ; Dl</w:t>
-      </w:r>
-    </w:p>
-    <w:p>
-      <w:r>
+      <w:proofErr w:type="spellStart"/>
+      <w:r>
+        <w:rPr>
+          <w:lang w:val="en-GB"/>
+        </w:rPr>
+        <w:t>Sl</w:t>
+      </w:r>
+      <w:proofErr w:type="spellEnd"/>
+      <w:r>
+        <w:rPr>
+          <w:lang w:val="en-GB"/>
+        </w:rPr>
+        <w:t xml:space="preserve"> -&gt; S </w:t>
+      </w:r>
+      <w:proofErr w:type="spellStart"/>
+      <w:r>
+        <w:rPr>
+          <w:lang w:val="en-GB"/>
+        </w:rPr>
+        <w:t>S</w:t>
+      </w:r>
+      <w:proofErr w:type="spellEnd"/>
+      <w:r>
+        <w:rPr>
+          <w:lang w:val="en-GB"/>
+        </w:rPr>
+        <w:t>´</w:t>
+      </w:r>
+    </w:p>
+    <w:p>
+      <w:pPr>
+        <w:rPr>
+          <w:lang w:val="en-GB"/>
+        </w:rPr>
+      </w:pPr>
+      <w:r>
+        <w:rPr>
+          <w:lang w:val="en-GB"/>
+        </w:rPr>
+        <w:t xml:space="preserve">S´ -&gt; ! | S </w:t>
+      </w:r>
+      <w:proofErr w:type="spellStart"/>
+      <w:r>
+        <w:rPr>
+          <w:lang w:val="en-GB"/>
+        </w:rPr>
+        <w:t>S</w:t>
+      </w:r>
+      <w:proofErr w:type="spellEnd"/>
+      <w:r>
+        <w:rPr>
+          <w:lang w:val="en-GB"/>
+        </w:rPr>
+        <w:t>´</w:t>
+      </w:r>
+    </w:p>
+    <w:p>
+      <w:pPr>
+        <w:rPr>
+          <w:lang w:val="en-GB"/>
+        </w:rPr>
+      </w:pPr>
+    </w:p>
+    <w:p>
+      <w:pPr>
+        <w:rPr>
+          <w:lang w:val="en-GB"/>
+        </w:rPr>
+      </w:pPr>
+      <w:r>
+        <w:rPr>
+          <w:lang w:val="en-GB"/>
+        </w:rPr>
+        <w:t xml:space="preserve">D -&gt; ',' pr :: id = SV C2l ; Dl | :: </w:t>
+      </w:r>
+      <w:proofErr w:type="spellStart"/>
+      <w:r>
+        <w:rPr>
+          <w:lang w:val="en-GB"/>
+        </w:rPr>
+        <w:t>Vl</w:t>
+      </w:r>
+      <w:proofErr w:type="spellEnd"/>
+      <w:r>
+        <w:rPr>
+          <w:lang w:val="en-GB"/>
+        </w:rPr>
+        <w:t xml:space="preserve"> ; Dl</w:t>
+      </w:r>
+    </w:p>
+    <w:p>
+      <w:pPr>
+        <w:rPr>
+          <w:lang w:val="en-GB"/>
+        </w:rPr>
+      </w:pPr>
+      <w:r>
+        <w:rPr>
+          <w:lang w:val="en-GB"/>
+        </w:rPr>
         <w:t>C2l -&gt; ',' id = SV</w:t>
       </w:r>
     </w:p>
@@ -123,12 +223,41 @@
         <w:rPr>
           <w:b/>
           <w:bCs/>
-        </w:rPr>
-      </w:pPr>
-      <w:r>
-        <w:t>SV -&gt; ni | nr | sc</w:t>
-      </w:r>
-      <w:r>
+          <w:lang w:val="en-GB"/>
+        </w:rPr>
+      </w:pPr>
+      <w:r>
+        <w:rPr>
+          <w:lang w:val="en-GB"/>
+        </w:rPr>
+        <w:t xml:space="preserve">SV -&gt; </w:t>
+      </w:r>
+      <w:proofErr w:type="spellStart"/>
+      <w:r>
+        <w:rPr>
+          <w:lang w:val="en-GB"/>
+        </w:rPr>
+        <w:t>ni</w:t>
+      </w:r>
+      <w:proofErr w:type="spellEnd"/>
+      <w:r>
+        <w:rPr>
+          <w:lang w:val="en-GB"/>
+        </w:rPr>
+        <w:t xml:space="preserve"> | nr | </w:t>
+      </w:r>
+      <w:proofErr w:type="spellStart"/>
+      <w:r>
+        <w:rPr>
+          <w:lang w:val="en-GB"/>
+        </w:rPr>
+        <w:t>sc</w:t>
+      </w:r>
+      <w:proofErr w:type="spellEnd"/>
+      <w:r>
+        <w:rPr>
+          <w:lang w:val="en-GB"/>
+        </w:rPr>
         <w:t xml:space="preserve"> </w:t>
       </w:r>
       <w:r>
@@ -136,39 +265,84 @@
           <w:b/>
           <w:bCs/>
           <w:color w:val="0070C0"/>
+          <w:lang w:val="en-GB"/>
         </w:rPr>
         <w:t>| bin |oct | hex</w:t>
       </w:r>
     </w:p>
     <w:p>
-      <w:r>
-        <w:t>T -&gt; int | r | ch C3</w:t>
-      </w:r>
-    </w:p>
-    <w:p>
-      <w:pPr>
-        <w:rPr>
-          <w:lang w:val="en-GB"/>
-        </w:rPr>
-      </w:pPr>
-      <w:r>
-        <w:rPr>
-          <w:lang w:val="en-GB"/>
-        </w:rPr>
-        <w:t>Vl -&gt; id I V´</w:t>
-      </w:r>
-    </w:p>
-    <w:p>
-      <w:pPr>
-        <w:rPr>
-          <w:lang w:val="en-GB"/>
-        </w:rPr>
-      </w:pPr>
-      <w:r>
-        <w:rPr>
-          <w:lang w:val="en-GB"/>
-        </w:rPr>
-        <w:t>V´ -&gt; ! | ',' id I V´</w:t>
+      <w:pPr>
+        <w:rPr>
+          <w:lang w:val="en-GB"/>
+        </w:rPr>
+      </w:pPr>
+      <w:r>
+        <w:rPr>
+          <w:lang w:val="en-GB"/>
+        </w:rPr>
+        <w:t xml:space="preserve">T -&gt; int | r | </w:t>
+      </w:r>
+      <w:proofErr w:type="spellStart"/>
+      <w:r>
+        <w:rPr>
+          <w:lang w:val="en-GB"/>
+        </w:rPr>
+        <w:t>ch</w:t>
+      </w:r>
+      <w:proofErr w:type="spellEnd"/>
+      <w:r>
+        <w:rPr>
+          <w:lang w:val="en-GB"/>
+        </w:rPr>
+        <w:t xml:space="preserve"> C3</w:t>
+      </w:r>
+    </w:p>
+    <w:p>
+      <w:pPr>
+        <w:rPr>
+          <w:lang w:val="en-GB"/>
+        </w:rPr>
+      </w:pPr>
+      <w:proofErr w:type="spellStart"/>
+      <w:r>
+        <w:rPr>
+          <w:lang w:val="en-GB"/>
+        </w:rPr>
+        <w:t>Vl</w:t>
+      </w:r>
+      <w:proofErr w:type="spellEnd"/>
+      <w:r>
+        <w:rPr>
+          <w:lang w:val="en-GB"/>
+        </w:rPr>
+        <w:t xml:space="preserve"> -&gt; id I V´</w:t>
+      </w:r>
+    </w:p>
+    <w:p>
+      <w:pPr>
+        <w:rPr>
+          <w:lang w:val="en-GB"/>
+        </w:rPr>
+      </w:pPr>
+      <w:r>
+        <w:rPr>
+          <w:lang w:val="en-GB"/>
+        </w:rPr>
+        <w:t xml:space="preserve">V´ -&gt; ! | ',' </w:t>
+      </w:r>
+      <w:proofErr w:type="spellStart"/>
+      <w:r>
+        <w:rPr>
+          <w:lang w:val="en-GB"/>
+        </w:rPr>
+        <w:t>id</w:t>
+      </w:r>
+      <w:proofErr w:type="spellEnd"/>
+      <w:r>
+        <w:rPr>
+          <w:lang w:val="en-GB"/>
+        </w:rPr>
+        <w:t xml:space="preserve"> I V´</w:t>
       </w:r>
     </w:p>
     <w:p>
@@ -198,36 +372,78 @@
     <w:p/>
     <w:p>
       <w:r>
-        <w:t>DP2 -&gt; sr id FP3l DPl e sr id</w:t>
-      </w:r>
-    </w:p>
-    <w:p>
-      <w:r>
-        <w:t>FP3l -&gt; ! | '(' Pl ')'</w:t>
-      </w:r>
-    </w:p>
-    <w:p>
-      <w:r>
-        <w:t>Pl -&gt; id N´</w:t>
-      </w:r>
-    </w:p>
-    <w:p>
-      <w:r>
-        <w:t>N´ -&gt; ! | ',' Pl</w:t>
-      </w:r>
-    </w:p>
-    <w:p>
-      <w:pPr>
-        <w:rPr>
-          <w:lang w:val="en-GB"/>
-        </w:rPr>
-      </w:pPr>
-      <w:r>
-        <w:rPr>
-          <w:lang w:val="en-GB"/>
-        </w:rPr>
-        <w:t>DPl -&gt; ! | T ',' it '(' TP ')' id ; DPl</w:t>
-      </w:r>
+        <w:t xml:space="preserve">DP2 -&gt; sr id FP3l </w:t>
+      </w:r>
+      <w:proofErr w:type="spellStart"/>
+      <w:r>
+        <w:t>DPl</w:t>
+      </w:r>
+      <w:proofErr w:type="spellEnd"/>
+      <w:r>
+        <w:t xml:space="preserve"> e sr id</w:t>
+      </w:r>
+    </w:p>
+    <w:p>
+      <w:r>
+        <w:t xml:space="preserve">FP3l -&gt; ! | '(' </w:t>
+      </w:r>
+      <w:proofErr w:type="spellStart"/>
+      <w:r>
+        <w:t>Pl</w:t>
+      </w:r>
+      <w:proofErr w:type="spellEnd"/>
+      <w:r>
+        <w:t xml:space="preserve"> ')'</w:t>
+      </w:r>
+    </w:p>
+    <w:p>
+      <w:proofErr w:type="spellStart"/>
+      <w:r>
+        <w:t>Pl</w:t>
+      </w:r>
+      <w:proofErr w:type="spellEnd"/>
+      <w:r>
+        <w:t xml:space="preserve"> -&gt; id N´</w:t>
+      </w:r>
+    </w:p>
+    <w:p>
+      <w:r>
+        <w:t xml:space="preserve">N´ -&gt; ! | ',' </w:t>
+      </w:r>
+      <w:proofErr w:type="spellStart"/>
+      <w:r>
+        <w:t>Pl</w:t>
+      </w:r>
+      <w:proofErr w:type="spellEnd"/>
+    </w:p>
+    <w:p>
+      <w:pPr>
+        <w:rPr>
+          <w:lang w:val="en-GB"/>
+        </w:rPr>
+      </w:pPr>
+      <w:proofErr w:type="spellStart"/>
+      <w:r>
+        <w:rPr>
+          <w:lang w:val="en-GB"/>
+        </w:rPr>
+        <w:t>DPl</w:t>
+      </w:r>
+      <w:proofErr w:type="spellEnd"/>
+      <w:r>
+        <w:rPr>
+          <w:lang w:val="en-GB"/>
+        </w:rPr>
+        <w:t xml:space="preserve"> -&gt; ! | T ',' it '(' TP ')' id ; </w:t>
+      </w:r>
+      <w:proofErr w:type="spellStart"/>
+      <w:r>
+        <w:rPr>
+          <w:lang w:val="en-GB"/>
+        </w:rPr>
+        <w:t>DPl</w:t>
+      </w:r>
+      <w:proofErr w:type="spellEnd"/>
     </w:p>
     <w:p>
       <w:pPr>
@@ -252,21 +468,51 @@
         <w:rPr>
           <w:lang w:val="en-GB"/>
         </w:rPr>
-        <w:t>DF -&gt; f id '(' Pl ')' T :: id ; DFPl e f id</w:t>
-      </w:r>
-    </w:p>
-    <w:p>
-      <w:pPr>
-        <w:rPr>
-          <w:lang w:val="en-GB"/>
-        </w:rPr>
-      </w:pPr>
-      <w:r>
-        <w:rPr>
-          <w:lang w:val="en-GB"/>
-        </w:rPr>
-        <w:t>DFPl -&gt; ! | T ',' it '(' in ')' id ; DFPl</w:t>
-      </w:r>
+        <w:t xml:space="preserve">DF -&gt; f id '(' Pl ')' T :: id ; </w:t>
+      </w:r>
+      <w:proofErr w:type="spellStart"/>
+      <w:r>
+        <w:rPr>
+          <w:lang w:val="en-GB"/>
+        </w:rPr>
+        <w:t>DFPl</w:t>
+      </w:r>
+      <w:proofErr w:type="spellEnd"/>
+      <w:r>
+        <w:rPr>
+          <w:lang w:val="en-GB"/>
+        </w:rPr>
+        <w:t xml:space="preserve"> e f id</w:t>
+      </w:r>
+    </w:p>
+    <w:p>
+      <w:pPr>
+        <w:rPr>
+          <w:lang w:val="en-GB"/>
+        </w:rPr>
+      </w:pPr>
+      <w:proofErr w:type="spellStart"/>
+      <w:r>
+        <w:rPr>
+          <w:lang w:val="en-GB"/>
+        </w:rPr>
+        <w:t>DFPl</w:t>
+      </w:r>
+      <w:proofErr w:type="spellEnd"/>
+      <w:r>
+        <w:rPr>
+          <w:lang w:val="en-GB"/>
+        </w:rPr>
+        <w:t xml:space="preserve"> -&gt; ! | T ',' it '(' in ')' id ; </w:t>
+      </w:r>
+      <w:proofErr w:type="spellStart"/>
+      <w:r>
+        <w:rPr>
+          <w:lang w:val="en-GB"/>
+        </w:rPr>
+        <w:t>DFPl</w:t>
+      </w:r>
+      <w:proofErr w:type="spellEnd"/>
     </w:p>
     <w:p>
       <w:pPr>
@@ -291,10 +537,112 @@
         <w:rPr>
           <w:lang w:val="en-GB"/>
         </w:rPr>
-        <w:t xml:space="preserve"> |</w:t>
-      </w:r>
-      <w:r>
-        <w:rPr>
+        <w:t xml:space="preserve"> | </w:t>
+      </w:r>
+      <w:r>
+        <w:rPr>
+          <w:b/>
+          <w:bCs/>
+          <w:color w:val="0070C0"/>
+          <w:lang w:val="en-GB"/>
+        </w:rPr>
+        <w:t xml:space="preserve">"IF" "(" </w:t>
+      </w:r>
+      <w:r>
+        <w:rPr>
+          <w:b/>
+          <w:bCs/>
+          <w:color w:val="0070C0"/>
+          <w:lang w:val="en-GB"/>
+        </w:rPr>
+        <w:t>EC</w:t>
+      </w:r>
+      <w:r>
+        <w:rPr>
+          <w:b/>
+          <w:bCs/>
+          <w:color w:val="0070C0"/>
+          <w:lang w:val="en-GB"/>
+        </w:rPr>
+        <w:t xml:space="preserve"> ")" </w:t>
+      </w:r>
+      <w:r>
+        <w:rPr>
+          <w:b/>
+          <w:bCs/>
+          <w:color w:val="0070C0"/>
+          <w:lang w:val="en-GB"/>
+        </w:rPr>
+        <w:t>S</w:t>
+      </w:r>
+      <w:r>
+        <w:rPr>
+          <w:b/>
+          <w:bCs/>
+          <w:color w:val="0070C0"/>
+          <w:lang w:val="en-GB"/>
+        </w:rPr>
+        <w:t>1</w:t>
+      </w:r>
+      <w:r>
+        <w:rPr>
+          <w:b/>
+          <w:bCs/>
+          <w:color w:val="0070C0"/>
+          <w:lang w:val="en-GB"/>
+        </w:rPr>
+        <w:t xml:space="preserve"> | "DO" </w:t>
+      </w:r>
+      <w:r>
+        <w:rPr>
+          <w:b/>
+          <w:bCs/>
+          <w:color w:val="0070C0"/>
+          <w:lang w:val="en-GB"/>
+        </w:rPr>
+        <w:t xml:space="preserve">S3 | </w:t>
+      </w:r>
+      <w:r>
+        <w:rPr>
+          <w:b/>
+          <w:bCs/>
+          <w:color w:val="0070C0"/>
+          <w:lang w:val="en-GB"/>
+        </w:rPr>
+        <w:t xml:space="preserve">"SELECT" "CASE" "(" </w:t>
+      </w:r>
+      <w:r>
+        <w:rPr>
+          <w:b/>
+          <w:bCs/>
+          <w:color w:val="0070C0"/>
+          <w:lang w:val="en-GB"/>
+        </w:rPr>
+        <w:t>E</w:t>
+      </w:r>
+      <w:r>
+        <w:rPr>
+          <w:b/>
+          <w:bCs/>
+          <w:color w:val="0070C0"/>
+          <w:lang w:val="en-GB"/>
+        </w:rPr>
+        <w:t xml:space="preserve"> ")" </w:t>
+      </w:r>
+      <w:r>
+        <w:rPr>
+          <w:b/>
+          <w:bCs/>
+          <w:color w:val="0070C0"/>
+          <w:lang w:val="en-GB"/>
+        </w:rPr>
+        <w:t>CA</w:t>
+      </w:r>
+      <w:r>
+        <w:rPr>
+          <w:b/>
+          <w:bCs/>
+          <w:color w:val="0070C0"/>
           <w:lang w:val="en-GB"/>
         </w:rPr>
         <w:t xml:space="preserve"> </w:t>
@@ -306,7 +654,149 @@
           <w:color w:val="0070C0"/>
           <w:lang w:val="en-GB"/>
         </w:rPr>
-        <w:t xml:space="preserve">"IF" "(" </w:t>
+        <w:t>e</w:t>
+      </w:r>
+      <w:r>
+        <w:rPr>
+          <w:b/>
+          <w:bCs/>
+          <w:color w:val="0070C0"/>
+          <w:lang w:val="en-GB"/>
+        </w:rPr>
+        <w:t xml:space="preserve"> "SELECT"</w:t>
+      </w:r>
+    </w:p>
+    <w:p>
+      <w:pPr>
+        <w:rPr>
+          <w:b/>
+          <w:bCs/>
+          <w:color w:val="0070C0"/>
+          <w:lang w:val="en-GB"/>
+        </w:rPr>
+      </w:pPr>
+      <w:r>
+        <w:rPr>
+          <w:b/>
+          <w:bCs/>
+          <w:color w:val="0070C0"/>
+          <w:lang w:val="en-GB"/>
+        </w:rPr>
+        <w:t xml:space="preserve">S1 -&gt; S | </w:t>
+      </w:r>
+      <w:r>
+        <w:rPr>
+          <w:b/>
+          <w:bCs/>
+          <w:color w:val="0070C0"/>
+          <w:lang w:val="en-GB"/>
+        </w:rPr>
+        <w:t xml:space="preserve">"THEN" </w:t>
+      </w:r>
+      <w:proofErr w:type="spellStart"/>
+      <w:r>
+        <w:rPr>
+          <w:b/>
+          <w:bCs/>
+          <w:color w:val="0070C0"/>
+          <w:lang w:val="en-GB"/>
+        </w:rPr>
+        <w:t>Sl</w:t>
+      </w:r>
+      <w:proofErr w:type="spellEnd"/>
+      <w:r>
+        <w:rPr>
+          <w:b/>
+          <w:bCs/>
+          <w:color w:val="0070C0"/>
+          <w:lang w:val="en-GB"/>
+        </w:rPr>
+        <w:t xml:space="preserve"> S2</w:t>
+      </w:r>
+    </w:p>
+    <w:p>
+      <w:pPr>
+        <w:rPr>
+          <w:b/>
+          <w:bCs/>
+          <w:color w:val="0070C0"/>
+          <w:lang w:val="en-GB"/>
+        </w:rPr>
+      </w:pPr>
+      <w:r>
+        <w:rPr>
+          <w:b/>
+          <w:bCs/>
+          <w:color w:val="0070C0"/>
+          <w:lang w:val="en-GB"/>
+        </w:rPr>
+        <w:t xml:space="preserve">S2 -&gt; “ENDIF” | </w:t>
+      </w:r>
+      <w:r>
+        <w:rPr>
+          <w:b/>
+          <w:bCs/>
+          <w:color w:val="0070C0"/>
+          <w:lang w:val="en-GB"/>
+        </w:rPr>
+        <w:t>"ELSE"</w:t>
+      </w:r>
+      <w:r>
+        <w:rPr>
+          <w:b/>
+          <w:bCs/>
+          <w:color w:val="0070C0"/>
+          <w:lang w:val="en-GB"/>
+        </w:rPr>
+        <w:t xml:space="preserve"> </w:t>
+      </w:r>
+      <w:proofErr w:type="spellStart"/>
+      <w:r>
+        <w:rPr>
+          <w:b/>
+          <w:bCs/>
+          <w:color w:val="0070C0"/>
+          <w:lang w:val="en-GB"/>
+        </w:rPr>
+        <w:t>Sl</w:t>
+      </w:r>
+      <w:proofErr w:type="spellEnd"/>
+      <w:r>
+        <w:rPr>
+          <w:b/>
+          <w:bCs/>
+          <w:color w:val="0070C0"/>
+          <w:lang w:val="en-GB"/>
+        </w:rPr>
+        <w:t xml:space="preserve"> "ENDIF"</w:t>
+      </w:r>
+    </w:p>
+    <w:p>
+      <w:pPr>
+        <w:rPr>
+          <w:b/>
+          <w:bCs/>
+          <w:color w:val="0070C0"/>
+          <w:lang w:val="en-GB"/>
+        </w:rPr>
+      </w:pPr>
+      <w:r>
+        <w:rPr>
+          <w:b/>
+          <w:bCs/>
+          <w:color w:val="0070C0"/>
+          <w:lang w:val="en-GB"/>
+        </w:rPr>
+        <w:t xml:space="preserve">S3 -&gt; </w:t>
+      </w:r>
+      <w:r>
+        <w:rPr>
+          <w:b/>
+          <w:bCs/>
+          <w:color w:val="0070C0"/>
+          <w:lang w:val="en-GB"/>
+        </w:rPr>
+        <w:t xml:space="preserve">"WHILE" "(" </w:t>
       </w:r>
       <w:r>
         <w:rPr>
@@ -326,6 +816,7 @@
         </w:rPr>
         <w:t xml:space="preserve"> ")" </w:t>
       </w:r>
+      <w:proofErr w:type="spellStart"/>
       <w:r>
         <w:rPr>
           <w:b/>
@@ -342,61 +833,107 @@
           <w:color w:val="0070C0"/>
           <w:lang w:val="en-GB"/>
         </w:rPr>
-        <w:t>1</w:t>
-      </w:r>
-      <w:r>
-        <w:rPr>
-          <w:b/>
-          <w:bCs/>
-          <w:color w:val="0070C0"/>
-          <w:lang w:val="en-GB"/>
-        </w:rPr>
-        <w:t xml:space="preserve"> | "DO" </w:t>
-      </w:r>
-      <w:r>
-        <w:rPr>
-          <w:b/>
-          <w:bCs/>
-          <w:color w:val="0070C0"/>
-          <w:lang w:val="en-GB"/>
-        </w:rPr>
-        <w:t xml:space="preserve">S3 | </w:t>
-      </w:r>
-      <w:r>
-        <w:rPr>
-          <w:b/>
-          <w:bCs/>
-          <w:color w:val="0070C0"/>
-          <w:lang w:val="en-GB"/>
-        </w:rPr>
-        <w:t xml:space="preserve">"SELECT" "CASE" "(" </w:t>
-      </w:r>
-      <w:r>
-        <w:rPr>
-          <w:b/>
-          <w:bCs/>
-          <w:color w:val="0070C0"/>
-          <w:lang w:val="en-GB"/>
-        </w:rPr>
-        <w:t>E</w:t>
-      </w:r>
-      <w:r>
-        <w:rPr>
-          <w:b/>
-          <w:bCs/>
-          <w:color w:val="0070C0"/>
-          <w:lang w:val="en-GB"/>
-        </w:rPr>
-        <w:t xml:space="preserve"> ")" </w:t>
-      </w:r>
-      <w:r>
-        <w:rPr>
-          <w:b/>
-          <w:bCs/>
-          <w:color w:val="0070C0"/>
-          <w:lang w:val="en-GB"/>
-        </w:rPr>
-        <w:t>CA</w:t>
+        <w:t>l</w:t>
+      </w:r>
+      <w:proofErr w:type="spellEnd"/>
+      <w:r>
+        <w:rPr>
+          <w:b/>
+          <w:bCs/>
+          <w:color w:val="0070C0"/>
+          <w:lang w:val="en-GB"/>
+        </w:rPr>
+        <w:t xml:space="preserve"> "ENDDO"</w:t>
+      </w:r>
+      <w:r>
+        <w:rPr>
+          <w:b/>
+          <w:bCs/>
+          <w:color w:val="0070C0"/>
+          <w:lang w:val="en-GB"/>
+        </w:rPr>
+        <w:t xml:space="preserve"> | id</w:t>
+      </w:r>
+      <w:r>
+        <w:rPr>
+          <w:b/>
+          <w:bCs/>
+          <w:color w:val="0070C0"/>
+          <w:lang w:val="en-GB"/>
+        </w:rPr>
+        <w:t xml:space="preserve"> "=" </w:t>
+      </w:r>
+      <w:r>
+        <w:rPr>
+          <w:b/>
+          <w:bCs/>
+          <w:color w:val="0070C0"/>
+          <w:lang w:val="en-GB"/>
+        </w:rPr>
+        <w:t>D</w:t>
+      </w:r>
+      <w:r>
+        <w:rPr>
+          <w:b/>
+          <w:bCs/>
+          <w:color w:val="0070C0"/>
+          <w:lang w:val="en-GB"/>
+        </w:rPr>
+        <w:t>V</w:t>
+      </w:r>
+      <w:r>
+        <w:rPr>
+          <w:b/>
+          <w:bCs/>
+          <w:color w:val="0070C0"/>
+          <w:lang w:val="en-GB"/>
+        </w:rPr>
+        <w:t xml:space="preserve"> "," </w:t>
+      </w:r>
+      <w:r>
+        <w:rPr>
+          <w:b/>
+          <w:bCs/>
+          <w:color w:val="0070C0"/>
+          <w:lang w:val="en-GB"/>
+        </w:rPr>
+        <w:t>D</w:t>
+      </w:r>
+      <w:r>
+        <w:rPr>
+          <w:b/>
+          <w:bCs/>
+          <w:color w:val="0070C0"/>
+          <w:lang w:val="en-GB"/>
+        </w:rPr>
+        <w:t>V</w:t>
+      </w:r>
+      <w:r>
+        <w:rPr>
+          <w:b/>
+          <w:bCs/>
+          <w:color w:val="0070C0"/>
+          <w:lang w:val="en-GB"/>
+        </w:rPr>
+        <w:t xml:space="preserve"> "," </w:t>
+      </w:r>
+      <w:r>
+        <w:rPr>
+          <w:b/>
+          <w:bCs/>
+          <w:color w:val="0070C0"/>
+          <w:lang w:val="en-GB"/>
+        </w:rPr>
+        <w:t>D</w:t>
+      </w:r>
+      <w:r>
+        <w:rPr>
+          <w:b/>
+          <w:bCs/>
+          <w:color w:val="0070C0"/>
+          <w:lang w:val="en-GB"/>
+        </w:rPr>
+        <w:t>V</w:t>
       </w:r>
       <w:r>
         <w:rPr>
@@ -407,162 +944,7 @@
         </w:rPr>
         <w:t xml:space="preserve"> </w:t>
       </w:r>
-      <w:r>
-        <w:rPr>
-          <w:b/>
-          <w:bCs/>
-          <w:color w:val="0070C0"/>
-          <w:lang w:val="en-GB"/>
-        </w:rPr>
-        <w:t>e</w:t>
-      </w:r>
-      <w:r>
-        <w:rPr>
-          <w:b/>
-          <w:bCs/>
-          <w:color w:val="0070C0"/>
-          <w:lang w:val="en-GB"/>
-        </w:rPr>
-        <w:t xml:space="preserve"> "SELECT"</w:t>
-      </w:r>
-    </w:p>
-    <w:p>
-      <w:pPr>
-        <w:rPr>
-          <w:b/>
-          <w:bCs/>
-          <w:color w:val="0070C0"/>
-          <w:lang w:val="en-GB"/>
-        </w:rPr>
-      </w:pPr>
-      <w:r>
-        <w:rPr>
-          <w:b/>
-          <w:bCs/>
-          <w:color w:val="0070C0"/>
-          <w:lang w:val="en-GB"/>
-        </w:rPr>
-        <w:t xml:space="preserve">S1 -&gt; S | </w:t>
-      </w:r>
-      <w:r>
-        <w:rPr>
-          <w:b/>
-          <w:bCs/>
-          <w:color w:val="0070C0"/>
-          <w:lang w:val="en-GB"/>
-        </w:rPr>
-        <w:t xml:space="preserve">"THEN" </w:t>
-      </w:r>
-      <w:r>
-        <w:rPr>
-          <w:b/>
-          <w:bCs/>
-          <w:color w:val="0070C0"/>
-          <w:lang w:val="en-GB"/>
-        </w:rPr>
-        <w:t>Sl</w:t>
-      </w:r>
-      <w:r>
-        <w:rPr>
-          <w:b/>
-          <w:bCs/>
-          <w:color w:val="0070C0"/>
-          <w:lang w:val="en-GB"/>
-        </w:rPr>
-        <w:t xml:space="preserve"> S2</w:t>
-      </w:r>
-    </w:p>
-    <w:p>
-      <w:pPr>
-        <w:rPr>
-          <w:b/>
-          <w:bCs/>
-          <w:color w:val="0070C0"/>
-          <w:lang w:val="en-GB"/>
-        </w:rPr>
-      </w:pPr>
-      <w:r>
-        <w:rPr>
-          <w:b/>
-          <w:bCs/>
-          <w:color w:val="0070C0"/>
-          <w:lang w:val="en-GB"/>
-        </w:rPr>
-        <w:t xml:space="preserve">S2 -&gt; “ENDIF” | </w:t>
-      </w:r>
-      <w:r>
-        <w:rPr>
-          <w:b/>
-          <w:bCs/>
-          <w:color w:val="0070C0"/>
-          <w:lang w:val="en-GB"/>
-        </w:rPr>
-        <w:t>"ELSE"</w:t>
-      </w:r>
-      <w:r>
-        <w:rPr>
-          <w:b/>
-          <w:bCs/>
-          <w:color w:val="0070C0"/>
-          <w:lang w:val="en-GB"/>
-        </w:rPr>
-        <w:t xml:space="preserve"> Sl</w:t>
-      </w:r>
-      <w:r>
-        <w:rPr>
-          <w:b/>
-          <w:bCs/>
-          <w:color w:val="0070C0"/>
-          <w:lang w:val="en-GB"/>
-        </w:rPr>
-        <w:t xml:space="preserve"> "ENDIF"</w:t>
-      </w:r>
-    </w:p>
-    <w:p>
-      <w:pPr>
-        <w:rPr>
-          <w:b/>
-          <w:bCs/>
-          <w:color w:val="0070C0"/>
-          <w:lang w:val="en-GB"/>
-        </w:rPr>
-      </w:pPr>
-      <w:r>
-        <w:rPr>
-          <w:b/>
-          <w:bCs/>
-          <w:color w:val="0070C0"/>
-          <w:lang w:val="en-GB"/>
-        </w:rPr>
-        <w:t xml:space="preserve">S3 -&gt; </w:t>
-      </w:r>
-      <w:r>
-        <w:rPr>
-          <w:b/>
-          <w:bCs/>
-          <w:color w:val="0070C0"/>
-          <w:lang w:val="en-GB"/>
-        </w:rPr>
-        <w:t xml:space="preserve">"WHILE" "(" </w:t>
-      </w:r>
-      <w:r>
-        <w:rPr>
-          <w:b/>
-          <w:bCs/>
-          <w:color w:val="0070C0"/>
-          <w:lang w:val="en-GB"/>
-        </w:rPr>
-        <w:t>EC</w:t>
-      </w:r>
-      <w:r>
-        <w:rPr>
-          <w:b/>
-          <w:bCs/>
-          <w:color w:val="0070C0"/>
-          <w:lang w:val="en-GB"/>
-        </w:rPr>
-        <w:t xml:space="preserve"> ")" </w:t>
-      </w:r>
+      <w:proofErr w:type="spellStart"/>
       <w:r>
         <w:rPr>
           <w:b/>
@@ -579,145 +961,21 @@
           <w:color w:val="0070C0"/>
           <w:lang w:val="en-GB"/>
         </w:rPr>
-        <w:t>l "ENDDO"</w:t>
-      </w:r>
-      <w:r>
-        <w:rPr>
-          <w:b/>
-          <w:bCs/>
-          <w:color w:val="0070C0"/>
-          <w:lang w:val="en-GB"/>
-        </w:rPr>
-        <w:t xml:space="preserve"> | </w:t>
-      </w:r>
-      <w:r>
-        <w:rPr>
-          <w:b/>
-          <w:bCs/>
-          <w:color w:val="0070C0"/>
-          <w:lang w:val="en-GB"/>
-        </w:rPr>
-        <w:t>id</w:t>
-      </w:r>
-      <w:r>
-        <w:rPr>
-          <w:b/>
-          <w:bCs/>
-          <w:color w:val="0070C0"/>
-          <w:lang w:val="en-GB"/>
-        </w:rPr>
-        <w:t xml:space="preserve"> "=" </w:t>
-      </w:r>
-      <w:r>
-        <w:rPr>
-          <w:b/>
-          <w:bCs/>
-          <w:color w:val="0070C0"/>
-          <w:lang w:val="en-GB"/>
-        </w:rPr>
-        <w:t>D</w:t>
-      </w:r>
-      <w:r>
-        <w:rPr>
-          <w:b/>
-          <w:bCs/>
-          <w:color w:val="0070C0"/>
-          <w:lang w:val="en-GB"/>
-        </w:rPr>
-        <w:t>V</w:t>
-      </w:r>
-      <w:r>
-        <w:rPr>
-          <w:b/>
-          <w:bCs/>
-          <w:color w:val="0070C0"/>
-          <w:lang w:val="en-GB"/>
-        </w:rPr>
-        <w:t xml:space="preserve"> "," </w:t>
-      </w:r>
-      <w:r>
-        <w:rPr>
-          <w:b/>
-          <w:bCs/>
-          <w:color w:val="0070C0"/>
-          <w:lang w:val="en-GB"/>
-        </w:rPr>
-        <w:t>D</w:t>
-      </w:r>
-      <w:r>
-        <w:rPr>
-          <w:b/>
-          <w:bCs/>
-          <w:color w:val="0070C0"/>
-          <w:lang w:val="en-GB"/>
-        </w:rPr>
-        <w:t>V</w:t>
-      </w:r>
-      <w:r>
-        <w:rPr>
-          <w:b/>
-          <w:bCs/>
-          <w:color w:val="0070C0"/>
-          <w:lang w:val="en-GB"/>
-        </w:rPr>
-        <w:t xml:space="preserve"> "," </w:t>
-      </w:r>
-      <w:r>
-        <w:rPr>
-          <w:b/>
-          <w:bCs/>
-          <w:color w:val="0070C0"/>
-          <w:lang w:val="en-GB"/>
-        </w:rPr>
-        <w:t>D</w:t>
-      </w:r>
-      <w:r>
-        <w:rPr>
-          <w:b/>
-          <w:bCs/>
-          <w:color w:val="0070C0"/>
-          <w:lang w:val="en-GB"/>
-        </w:rPr>
-        <w:t>V</w:t>
-      </w:r>
-      <w:r>
-        <w:rPr>
-          <w:b/>
-          <w:bCs/>
-          <w:color w:val="0070C0"/>
-          <w:lang w:val="en-GB"/>
-        </w:rPr>
-        <w:t xml:space="preserve"> </w:t>
-      </w:r>
-      <w:r>
-        <w:rPr>
-          <w:b/>
-          <w:bCs/>
-          <w:color w:val="0070C0"/>
-          <w:lang w:val="en-GB"/>
-        </w:rPr>
-        <w:t>S</w:t>
-      </w:r>
-      <w:r>
-        <w:rPr>
-          <w:b/>
-          <w:bCs/>
-          <w:color w:val="0070C0"/>
-          <w:lang w:val="en-GB"/>
-        </w:rPr>
-        <w:t>l "ENDDO"</w:t>
-      </w:r>
-    </w:p>
-    <w:p>
-      <w:pPr>
-        <w:rPr>
-          <w:lang w:val="en-GB"/>
-        </w:rPr>
-      </w:pPr>
-      <w:r>
-        <w:rPr>
-          <w:lang w:val="en-GB"/>
-        </w:rPr>
+        <w:t>l</w:t>
+      </w:r>
+      <w:proofErr w:type="spellEnd"/>
+      <w:r>
+        <w:rPr>
+          <w:b/>
+          <w:bCs/>
+          <w:color w:val="0070C0"/>
+          <w:lang w:val="en-GB"/>
+        </w:rPr>
+        <w:t xml:space="preserve"> "ENDDO"</w:t>
+      </w:r>
+    </w:p>
+    <w:p>
+      <w:r>
         <w:t>E -&gt; F E´</w:t>
       </w:r>
     </w:p>
@@ -788,27 +1046,40 @@
         <w:rPr>
           <w:b/>
           <w:bCs/>
-          <w:color w:val="0070C0"/>
-          <w:lang w:val="en-GB"/>
-        </w:rPr>
-      </w:pPr>
-      <w:r>
-        <w:rPr>
-          <w:b/>
-          <w:bCs/>
-          <w:color w:val="0070C0"/>
-          <w:lang w:val="en-GB"/>
-        </w:rPr>
-        <w:t xml:space="preserve">EC1 -&gt; OL EC EC1 | </w:t>
-      </w:r>
-      <w:r>
-        <w:rPr>
-          <w:b/>
-          <w:bCs/>
-          <w:color w:val="0070C0"/>
-          <w:lang w:val="en-GB"/>
-        </w:rPr>
-        <w:t>!</w:t>
+          <w:color w:val="7030A0"/>
+        </w:rPr>
+      </w:pPr>
+      <w:r>
+        <w:rPr>
+          <w:b/>
+          <w:bCs/>
+          <w:color w:val="7030A0"/>
+        </w:rPr>
+        <w:t xml:space="preserve">EC1 -&gt; OL </w:t>
+      </w:r>
+      <w:r>
+        <w:rPr>
+          <w:b/>
+          <w:bCs/>
+          <w:color w:val="7030A0"/>
+        </w:rPr>
+        <w:t>F</w:t>
+      </w:r>
+      <w:r>
+        <w:rPr>
+          <w:b/>
+          <w:bCs/>
+          <w:color w:val="7030A0"/>
+        </w:rPr>
+        <w:t>C EC1 | !</w:t>
+      </w:r>
+      <w:r>
+        <w:rPr>
+          <w:b/>
+          <w:bCs/>
+          <w:color w:val="7030A0"/>
+        </w:rPr>
+        <w:t xml:space="preserve"> </w:t>
       </w:r>
     </w:p>
     <w:p>
@@ -866,16 +1137,7 @@
           <w:color w:val="0070C0"/>
           <w:lang w:val="en-GB"/>
         </w:rPr>
-        <w:t xml:space="preserve"> | </w:t>
-      </w:r>
-      <w:r>
-        <w:rPr>
-          <w:b/>
-          <w:bCs/>
-          <w:color w:val="0070C0"/>
-          <w:lang w:val="en-GB"/>
-        </w:rPr>
-        <w:t>".AND." | ".EQV." | ".NEQV."</w:t>
+        <w:t xml:space="preserve"> | ".AND." | ".EQV." | ".NEQV."</w:t>
       </w:r>
     </w:p>
     <w:p>
@@ -886,99 +1148,34 @@
         <w:rPr>
           <w:b/>
           <w:bCs/>
-          <w:color w:val="0070C0"/>
-          <w:lang w:val="en-GB"/>
-        </w:rPr>
-      </w:pPr>
-      <w:r>
-        <w:rPr>
-          <w:b/>
-          <w:bCs/>
-          <w:color w:val="0070C0"/>
-          <w:lang w:val="en-GB"/>
-        </w:rPr>
-        <w:t>FC -&gt;</w:t>
-      </w:r>
-      <w:r>
-        <w:rPr>
-          <w:b/>
-          <w:bCs/>
-          <w:color w:val="0070C0"/>
-          <w:lang w:val="en-GB"/>
+          <w:color w:val="7030A0"/>
+        </w:rPr>
+      </w:pPr>
+      <w:bookmarkStart w:id="0" w:name="_Hlk226543027"/>
+      <w:r>
+        <w:rPr>
+          <w:b/>
+          <w:bCs/>
+          <w:color w:val="7030A0"/>
+        </w:rPr>
+        <w:t xml:space="preserve">FC -&gt; ".NOT." FC | </w:t>
+      </w:r>
+      <w:r>
+        <w:rPr>
+          <w:b/>
+          <w:bCs/>
+          <w:color w:val="7030A0"/>
+        </w:rPr>
+        <w:t>FC1</w:t>
+      </w:r>
+      <w:bookmarkEnd w:id="0"/>
+      <w:r>
+        <w:rPr>
+          <w:b/>
+          <w:bCs/>
+          <w:color w:val="7030A0"/>
         </w:rPr>
         <w:t xml:space="preserve"> </w:t>
-      </w:r>
-      <w:r>
-        <w:rPr>
-          <w:b/>
-          <w:bCs/>
-          <w:color w:val="0070C0"/>
-          <w:lang w:val="en-GB"/>
-        </w:rPr>
-        <w:t>E OC</w:t>
-      </w:r>
-      <w:r>
-        <w:rPr>
-          <w:b/>
-          <w:bCs/>
-          <w:color w:val="0070C0"/>
-          <w:lang w:val="en-GB"/>
-        </w:rPr>
-        <w:t xml:space="preserve"> </w:t>
-      </w:r>
-      <w:r>
-        <w:rPr>
-          <w:b/>
-          <w:bCs/>
-          <w:color w:val="0070C0"/>
-          <w:lang w:val="en-GB"/>
-        </w:rPr>
-        <w:t>E</w:t>
-      </w:r>
-      <w:r>
-        <w:rPr>
-          <w:b/>
-          <w:bCs/>
-          <w:color w:val="0070C0"/>
-          <w:lang w:val="en-GB"/>
-        </w:rPr>
-        <w:t xml:space="preserve"> | "(" </w:t>
-      </w:r>
-      <w:r>
-        <w:rPr>
-          <w:b/>
-          <w:bCs/>
-          <w:color w:val="0070C0"/>
-          <w:lang w:val="en-GB"/>
-        </w:rPr>
-        <w:t>EC</w:t>
-      </w:r>
-      <w:r>
-        <w:rPr>
-          <w:b/>
-          <w:bCs/>
-          <w:color w:val="0070C0"/>
-          <w:lang w:val="en-GB"/>
-        </w:rPr>
-        <w:t xml:space="preserve"> ")" | ".NOT." </w:t>
-      </w:r>
-      <w:r>
-        <w:rPr>
-          <w:b/>
-          <w:bCs/>
-          <w:color w:val="0070C0"/>
-          <w:lang w:val="en-GB"/>
-        </w:rPr>
-        <w:t>FC</w:t>
-      </w:r>
-      <w:r>
-        <w:rPr>
-          <w:b/>
-          <w:bCs/>
-          <w:color w:val="0070C0"/>
-          <w:lang w:val="en-GB"/>
-        </w:rPr>
-        <w:t xml:space="preserve"> | ".TRUE." | ".FALSE."</w:t>
       </w:r>
     </w:p>
     <w:p>
@@ -989,25 +1186,17 @@
         <w:rPr>
           <w:b/>
           <w:bCs/>
-          <w:color w:val="0070C0"/>
-        </w:rPr>
-      </w:pPr>
-      <w:r>
-        <w:rPr>
-          <w:b/>
-          <w:bCs/>
-          <w:color w:val="0070C0"/>
-          <w:lang w:val="en-GB"/>
-        </w:rPr>
-        <w:t xml:space="preserve">OC -&gt; </w:t>
-      </w:r>
-      <w:r>
-        <w:rPr>
-          <w:b/>
-          <w:bCs/>
-          <w:color w:val="0070C0"/>
-        </w:rPr>
-        <w:t>"&lt;" | "&gt;" | "&lt;=" | "&gt;=" | "==" | "/="</w:t>
+          <w:color w:val="7030A0"/>
+        </w:rPr>
+      </w:pPr>
+      <w:bookmarkStart w:id="1" w:name="_Hlk226543081"/>
+      <w:r>
+        <w:rPr>
+          <w:b/>
+          <w:bCs/>
+          <w:color w:val="7030A0"/>
+        </w:rPr>
+        <w:t>FC1 -&gt; OC FC2| !</w:t>
       </w:r>
     </w:p>
     <w:p>
@@ -1018,32 +1207,113 @@
         <w:rPr>
           <w:b/>
           <w:bCs/>
-          <w:color w:val="0070C0"/>
-        </w:rPr>
-      </w:pPr>
-      <w:r>
-        <w:rPr>
-          <w:b/>
-          <w:bCs/>
-          <w:color w:val="0070C0"/>
-        </w:rPr>
-        <w:t>D</w:t>
-      </w:r>
-      <w:r>
-        <w:rPr>
-          <w:b/>
-          <w:bCs/>
-          <w:color w:val="0070C0"/>
-        </w:rPr>
-        <w:t>V</w:t>
-      </w:r>
-      <w:r>
-        <w:rPr>
-          <w:b/>
-          <w:bCs/>
-          <w:color w:val="0070C0"/>
-        </w:rPr>
-        <w:t xml:space="preserve"> -&gt; ni | id</w:t>
+          <w:color w:val="7030A0"/>
+        </w:rPr>
+      </w:pPr>
+      <w:bookmarkStart w:id="2" w:name="_Hlk226543125"/>
+      <w:bookmarkEnd w:id="1"/>
+      <w:r>
+        <w:rPr>
+          <w:b/>
+          <w:bCs/>
+          <w:color w:val="7030A0"/>
+        </w:rPr>
+        <w:t xml:space="preserve">FC2 -&gt; </w:t>
+      </w:r>
+      <w:r>
+        <w:rPr>
+          <w:b/>
+          <w:bCs/>
+          <w:color w:val="7030A0"/>
+        </w:rPr>
+        <w:t xml:space="preserve">id SP3l </w:t>
+      </w:r>
+      <w:r>
+        <w:rPr>
+          <w:b/>
+          <w:bCs/>
+          <w:color w:val="7030A0"/>
+        </w:rPr>
+        <w:t xml:space="preserve">E´ </w:t>
+      </w:r>
+      <w:bookmarkEnd w:id="2"/>
+      <w:r>
+        <w:rPr>
+          <w:b/>
+          <w:bCs/>
+          <w:color w:val="7030A0"/>
+        </w:rPr>
+        <w:t xml:space="preserve">| </w:t>
+      </w:r>
+      <w:bookmarkStart w:id="3" w:name="_Hlk226543156"/>
+      <w:r>
+        <w:rPr>
+          <w:b/>
+          <w:bCs/>
+          <w:color w:val="7030A0"/>
+        </w:rPr>
+        <w:t xml:space="preserve">SV </w:t>
+      </w:r>
+      <w:r>
+        <w:rPr>
+          <w:b/>
+          <w:bCs/>
+          <w:color w:val="7030A0"/>
+        </w:rPr>
+        <w:t xml:space="preserve">E´ </w:t>
+      </w:r>
+      <w:bookmarkEnd w:id="3"/>
+      <w:r>
+        <w:rPr>
+          <w:b/>
+          <w:bCs/>
+          <w:color w:val="7030A0"/>
+        </w:rPr>
+        <w:t xml:space="preserve">| </w:t>
+      </w:r>
+      <w:bookmarkStart w:id="4" w:name="_Hlk226543169"/>
+      <w:r>
+        <w:rPr>
+          <w:b/>
+          <w:bCs/>
+          <w:color w:val="7030A0"/>
+        </w:rPr>
+        <w:t xml:space="preserve">"(" FC ")" </w:t>
+      </w:r>
+      <w:bookmarkEnd w:id="4"/>
+      <w:r>
+        <w:rPr>
+          <w:b/>
+          <w:bCs/>
+          <w:color w:val="7030A0"/>
+        </w:rPr>
+        <w:t xml:space="preserve">| </w:t>
+      </w:r>
+      <w:bookmarkStart w:id="5" w:name="_Hlk226543180"/>
+      <w:r>
+        <w:rPr>
+          <w:b/>
+          <w:bCs/>
+          <w:color w:val="7030A0"/>
+        </w:rPr>
+        <w:t>".TRUE."</w:t>
+      </w:r>
+      <w:r>
+        <w:rPr>
+          <w:b/>
+          <w:bCs/>
+          <w:color w:val="7030A0"/>
+        </w:rPr>
+        <w:t xml:space="preserve"> </w:t>
+      </w:r>
+      <w:bookmarkEnd w:id="5"/>
+      <w:r>
+        <w:rPr>
+          <w:b/>
+          <w:bCs/>
+          <w:color w:val="7030A0"/>
+        </w:rPr>
+        <w:t>| ".FALSE."</w:t>
       </w:r>
     </w:p>
     <w:p>
@@ -1063,31 +1333,7 @@
           <w:bCs/>
           <w:color w:val="0070C0"/>
         </w:rPr>
-        <w:t xml:space="preserve">CA -&gt; </w:t>
-      </w:r>
-      <w:r>
-        <w:rPr>
-          <w:b/>
-          <w:bCs/>
-          <w:color w:val="0070C0"/>
-        </w:rPr>
-        <w:t xml:space="preserve">"CASE" </w:t>
-      </w:r>
-      <w:r>
-        <w:rPr>
-          <w:b/>
-          <w:bCs/>
-          <w:color w:val="0070C0"/>
-        </w:rPr>
-        <w:t>CA1</w:t>
-      </w:r>
-      <w:r>
-        <w:rPr>
-          <w:b/>
-          <w:bCs/>
-          <w:color w:val="0070C0"/>
-        </w:rPr>
-        <w:t xml:space="preserve"> | !</w:t>
+        <w:t>OC -&gt; "&lt;" | "&gt;" | "&lt;=" | "&gt;=" | "==" | "/="</w:t>
       </w:r>
     </w:p>
     <w:p>
@@ -1099,39 +1345,55 @@
           <w:b/>
           <w:bCs/>
           <w:color w:val="0070C0"/>
-        </w:rPr>
-      </w:pPr>
-      <w:r>
-        <w:rPr>
-          <w:b/>
-          <w:bCs/>
-          <w:color w:val="0070C0"/>
-        </w:rPr>
-        <w:t xml:space="preserve">CA1 -&gt; </w:t>
-      </w:r>
-      <w:r>
-        <w:rPr>
-          <w:b/>
-          <w:bCs/>
-          <w:color w:val="0070C0"/>
-        </w:rPr>
-        <w:t>"(" ET ")" Sl CA</w:t>
-      </w:r>
-      <w:r>
-        <w:rPr>
-          <w:b/>
-          <w:bCs/>
-          <w:color w:val="0070C0"/>
-        </w:rPr>
-        <w:t xml:space="preserve"> | </w:t>
-      </w:r>
-      <w:r>
-        <w:rPr>
-          <w:b/>
-          <w:bCs/>
-          <w:color w:val="0070C0"/>
-        </w:rPr>
-        <w:t>"DEFAULT" Sl</w:t>
+          <w:lang w:val="en-GB"/>
+        </w:rPr>
+      </w:pPr>
+      <w:r>
+        <w:rPr>
+          <w:b/>
+          <w:bCs/>
+          <w:color w:val="0070C0"/>
+          <w:lang w:val="en-GB"/>
+        </w:rPr>
+        <w:t>D</w:t>
+      </w:r>
+      <w:r>
+        <w:rPr>
+          <w:b/>
+          <w:bCs/>
+          <w:color w:val="0070C0"/>
+          <w:lang w:val="en-GB"/>
+        </w:rPr>
+        <w:t>V</w:t>
+      </w:r>
+      <w:r>
+        <w:rPr>
+          <w:b/>
+          <w:bCs/>
+          <w:color w:val="0070C0"/>
+          <w:lang w:val="en-GB"/>
+        </w:rPr>
+        <w:t xml:space="preserve"> -&gt; </w:t>
+      </w:r>
+      <w:proofErr w:type="spellStart"/>
+      <w:r>
+        <w:rPr>
+          <w:b/>
+          <w:bCs/>
+          <w:color w:val="0070C0"/>
+          <w:lang w:val="en-GB"/>
+        </w:rPr>
+        <w:t>ni</w:t>
+      </w:r>
+      <w:proofErr w:type="spellEnd"/>
+      <w:r>
+        <w:rPr>
+          <w:b/>
+          <w:bCs/>
+          <w:color w:val="0070C0"/>
+          <w:lang w:val="en-GB"/>
+        </w:rPr>
+        <w:t xml:space="preserve"> | id</w:t>
       </w:r>
     </w:p>
     <w:p>
@@ -1143,47 +1405,44 @@
           <w:b/>
           <w:bCs/>
           <w:color w:val="0070C0"/>
-        </w:rPr>
-      </w:pPr>
-      <w:r>
-        <w:rPr>
-          <w:b/>
-          <w:bCs/>
-          <w:color w:val="0070C0"/>
-        </w:rPr>
-        <w:t>ET -&gt;</w:t>
-      </w:r>
-      <w:r>
-        <w:rPr>
-          <w:b/>
-          <w:bCs/>
-          <w:color w:val="0070C0"/>
-        </w:rPr>
-        <w:t xml:space="preserve"> SV </w:t>
-      </w:r>
-      <w:r>
-        <w:rPr>
-          <w:b/>
-          <w:bCs/>
-          <w:color w:val="0070C0"/>
-        </w:rPr>
-        <w:t xml:space="preserve">ET1 </w:t>
-      </w:r>
-      <w:r>
-        <w:rPr>
-          <w:b/>
-          <w:bCs/>
-          <w:color w:val="0070C0"/>
-        </w:rPr>
-        <w:t xml:space="preserve">| ":" </w:t>
-      </w:r>
-      <w:r>
-        <w:rPr>
-          <w:b/>
-          <w:bCs/>
-          <w:color w:val="0070C0"/>
-        </w:rPr>
-        <w:t>SV</w:t>
+          <w:lang w:val="en-GB"/>
+        </w:rPr>
+      </w:pPr>
+      <w:r>
+        <w:rPr>
+          <w:b/>
+          <w:bCs/>
+          <w:color w:val="0070C0"/>
+          <w:lang w:val="en-GB"/>
+        </w:rPr>
+        <w:t xml:space="preserve">CA -&gt; </w:t>
+      </w:r>
+      <w:r>
+        <w:rPr>
+          <w:b/>
+          <w:bCs/>
+          <w:color w:val="0070C0"/>
+          <w:lang w:val="en-GB"/>
+        </w:rPr>
+        <w:t xml:space="preserve">"CASE" </w:t>
+      </w:r>
+      <w:r>
+        <w:rPr>
+          <w:b/>
+          <w:bCs/>
+          <w:color w:val="0070C0"/>
+          <w:lang w:val="en-GB"/>
+        </w:rPr>
+        <w:t>CA1</w:t>
+      </w:r>
+      <w:r>
+        <w:rPr>
+          <w:b/>
+          <w:bCs/>
+          <w:color w:val="0070C0"/>
+          <w:lang w:val="en-GB"/>
+        </w:rPr>
+        <w:t xml:space="preserve"> | !</w:t>
       </w:r>
     </w:p>
     <w:p>
@@ -1195,24 +1454,49 @@
           <w:b/>
           <w:bCs/>
           <w:color w:val="0070C0"/>
-        </w:rPr>
-      </w:pPr>
-      <w:r>
-        <w:rPr>
-          <w:b/>
-          <w:bCs/>
-          <w:color w:val="0070C0"/>
-        </w:rPr>
-        <w:t>ET1 -&gt; L</w:t>
-      </w:r>
-      <w:r>
-        <w:rPr>
-          <w:b/>
-          <w:bCs/>
-          <w:color w:val="0070C0"/>
-        </w:rPr>
-        <w:t>E | “:” ET2</w:t>
-      </w:r>
+          <w:lang w:val="en-GB"/>
+        </w:rPr>
+      </w:pPr>
+      <w:r>
+        <w:rPr>
+          <w:b/>
+          <w:bCs/>
+          <w:color w:val="0070C0"/>
+          <w:lang w:val="en-GB"/>
+        </w:rPr>
+        <w:t xml:space="preserve">CA1 -&gt; "(" ET ")" </w:t>
+      </w:r>
+      <w:proofErr w:type="spellStart"/>
+      <w:r>
+        <w:rPr>
+          <w:b/>
+          <w:bCs/>
+          <w:color w:val="0070C0"/>
+          <w:lang w:val="en-GB"/>
+        </w:rPr>
+        <w:t>Sl</w:t>
+      </w:r>
+      <w:proofErr w:type="spellEnd"/>
+      <w:r>
+        <w:rPr>
+          <w:b/>
+          <w:bCs/>
+          <w:color w:val="0070C0"/>
+          <w:lang w:val="en-GB"/>
+        </w:rPr>
+        <w:t xml:space="preserve"> CA | "DEFAULT" </w:t>
+      </w:r>
+      <w:proofErr w:type="spellStart"/>
+      <w:r>
+        <w:rPr>
+          <w:b/>
+          <w:bCs/>
+          <w:color w:val="0070C0"/>
+          <w:lang w:val="en-GB"/>
+        </w:rPr>
+        <w:t>Sl</w:t>
+      </w:r>
+      <w:proofErr w:type="spellEnd"/>
     </w:p>
     <w:p>
       <w:pPr>
@@ -1223,15 +1507,44 @@
           <w:b/>
           <w:bCs/>
           <w:color w:val="0070C0"/>
-        </w:rPr>
-      </w:pPr>
-      <w:r>
-        <w:rPr>
-          <w:b/>
-          <w:bCs/>
-          <w:color w:val="0070C0"/>
-        </w:rPr>
-        <w:t>ET2 -&gt; SV | !</w:t>
+          <w:lang w:val="en-GB"/>
+        </w:rPr>
+      </w:pPr>
+      <w:r>
+        <w:rPr>
+          <w:b/>
+          <w:bCs/>
+          <w:color w:val="0070C0"/>
+          <w:lang w:val="en-GB"/>
+        </w:rPr>
+        <w:t>ET -&gt;</w:t>
+      </w:r>
+      <w:r>
+        <w:rPr>
+          <w:b/>
+          <w:bCs/>
+          <w:color w:val="0070C0"/>
+          <w:lang w:val="en-GB"/>
+        </w:rPr>
+        <w:t xml:space="preserve"> SV </w:t>
+      </w:r>
+      <w:r>
+        <w:rPr>
+          <w:b/>
+          <w:bCs/>
+          <w:color w:val="0070C0"/>
+          <w:lang w:val="en-GB"/>
+        </w:rPr>
+        <w:t xml:space="preserve">ET1 </w:t>
+      </w:r>
+      <w:r>
+        <w:rPr>
+          <w:b/>
+          <w:bCs/>
+          <w:color w:val="0070C0"/>
+          <w:lang w:val="en-GB"/>
+        </w:rPr>
+        <w:t>| ":" SV</w:t>
       </w:r>
     </w:p>
     <w:p>
@@ -1251,6 +1564,54 @@
           <w:bCs/>
           <w:color w:val="0070C0"/>
         </w:rPr>
+        <w:t>ET1 -&gt; L</w:t>
+      </w:r>
+      <w:r>
+        <w:rPr>
+          <w:b/>
+          <w:bCs/>
+          <w:color w:val="0070C0"/>
+        </w:rPr>
+        <w:t>E | “:” ET2</w:t>
+      </w:r>
+    </w:p>
+    <w:p>
+      <w:pPr>
+        <w:tabs>
+          <w:tab w:val="left" w:pos="2705"/>
+        </w:tabs>
+        <w:rPr>
+          <w:b/>
+          <w:bCs/>
+          <w:color w:val="0070C0"/>
+        </w:rPr>
+      </w:pPr>
+      <w:r>
+        <w:rPr>
+          <w:b/>
+          <w:bCs/>
+          <w:color w:val="0070C0"/>
+        </w:rPr>
+        <w:t>ET2 -&gt; SV | !</w:t>
+      </w:r>
+    </w:p>
+    <w:p>
+      <w:pPr>
+        <w:tabs>
+          <w:tab w:val="left" w:pos="2705"/>
+        </w:tabs>
+        <w:rPr>
+          <w:b/>
+          <w:bCs/>
+          <w:color w:val="0070C0"/>
+        </w:rPr>
+      </w:pPr>
+      <w:r>
+        <w:rPr>
+          <w:b/>
+          <w:bCs/>
+          <w:color w:val="0070C0"/>
+        </w:rPr>
         <w:t xml:space="preserve">LE -&gt; </w:t>
       </w:r>
       <w:r>
@@ -1310,12 +1671,36 @@
     </w:p>
     <w:p>
       <w:r>
-        <w:t>CD -&gt; sr id FP3l Y1 Sl e sr id</w:t>
-      </w:r>
-    </w:p>
-    <w:p>
-      <w:r>
-        <w:t>CF -&gt; f id '(' Pl ')' T :: id ; Z1 Sl id = E ; e f id</w:t>
+        <w:t xml:space="preserve">CD -&gt; sr id FP3l Y1 </w:t>
+      </w:r>
+      <w:proofErr w:type="spellStart"/>
+      <w:r>
+        <w:t>Sl</w:t>
+      </w:r>
+      <w:proofErr w:type="spellEnd"/>
+      <w:r>
+        <w:t xml:space="preserve"> e sr id</w:t>
+      </w:r>
+    </w:p>
+    <w:p>
+      <w:r>
+        <w:t xml:space="preserve">CF -&gt; f id '(' </w:t>
+      </w:r>
+      <w:proofErr w:type="spellStart"/>
+      <w:r>
+        <w:t>Pl</w:t>
+      </w:r>
+      <w:proofErr w:type="spellEnd"/>
+      <w:r>
+        <w:t xml:space="preserve"> ')' T :: id ; Z1 </w:t>
+      </w:r>
+      <w:proofErr w:type="spellStart"/>
+      <w:r>
+        <w:t>Sl</w:t>
+      </w:r>
+      <w:proofErr w:type="spellEnd"/>
+      <w:r>
+        <w:t xml:space="preserve"> id = E ; e f id</w:t>
       </w:r>
     </w:p>
     <w:p/>
@@ -1326,12 +1711,36 @@
     </w:p>
     <w:p>
       <w:r>
-        <w:t>Y2 -&gt; ',' Y3 | :: Vl ; Dl</w:t>
-      </w:r>
-    </w:p>
-    <w:p>
-      <w:r>
-        <w:t>Y3 -&gt; it '(' TP ')' id ; Y1 | pr :: id = SV C2l ; Dl</w:t>
+        <w:t xml:space="preserve">Y2 -&gt; ',' Y3 | :: </w:t>
+      </w:r>
+      <w:proofErr w:type="spellStart"/>
+      <w:r>
+        <w:t>Vl</w:t>
+      </w:r>
+      <w:proofErr w:type="spellEnd"/>
+      <w:r>
+        <w:t xml:space="preserve"> ; Dl</w:t>
+      </w:r>
+    </w:p>
+    <w:p>
+      <w:r>
+        <w:t xml:space="preserve">Y3 -&gt; </w:t>
+      </w:r>
+      <w:proofErr w:type="spellStart"/>
+      <w:r>
+        <w:t>it</w:t>
+      </w:r>
+      <w:proofErr w:type="spellEnd"/>
+      <w:r>
+        <w:t xml:space="preserve"> '(' TP ')' id ; Y1 | </w:t>
+      </w:r>
+      <w:proofErr w:type="spellStart"/>
+      <w:r>
+        <w:t>pr</w:t>
+      </w:r>
+      <w:proofErr w:type="spellEnd"/>
+      <w:r>
+        <w:t xml:space="preserve"> :: id = SV C2l ; Dl</w:t>
       </w:r>
     </w:p>
     <w:p/>
@@ -1342,56 +1751,30 @@
     </w:p>
     <w:p>
       <w:r>
-        <w:t>Z2 -&gt; ',' Z3 | :: Vl ; Dl</w:t>
-      </w:r>
-    </w:p>
-    <w:p>
-      <w:pPr>
-        <w:rPr>
-          <w:lang w:val="en-GB"/>
-        </w:rPr>
-      </w:pPr>
-      <w:r>
-        <w:rPr>
-          <w:lang w:val="en-GB"/>
-        </w:rPr>
+        <w:t xml:space="preserve">Z2 -&gt; ',' Z3 | :: </w:t>
+      </w:r>
+      <w:proofErr w:type="spellStart"/>
+      <w:r>
+        <w:t>Vl</w:t>
+      </w:r>
+      <w:proofErr w:type="spellEnd"/>
+      <w:r>
+        <w:t xml:space="preserve"> ; Dl</w:t>
+      </w:r>
+    </w:p>
+    <w:p>
+      <w:pPr>
+        <w:rPr>
+          <w:lang w:val="en-GB"/>
+        </w:rPr>
+      </w:pPr>
+      <w:r>
+        <w:rPr>
+          <w:lang w:val="en-GB"/>
+        </w:rPr>
+        <w:lastRenderedPageBreak/>
         <w:t>Z3 -&gt; it '(' in ')' id ; Z1 | pr :: id = SV C2l ; Dl</w:t>
       </w:r>
-    </w:p>
-    <w:p>
-      <w:pPr>
-        <w:rPr>
-          <w:lang w:val="en-GB"/>
-        </w:rPr>
-      </w:pPr>
-    </w:p>
-    <w:p>
-      <w:pPr>
-        <w:rPr>
-          <w:lang w:val="en-GB"/>
-        </w:rPr>
-      </w:pPr>
-    </w:p>
-    <w:p>
-      <w:pPr>
-        <w:rPr>
-          <w:lang w:val="en-GB"/>
-        </w:rPr>
-      </w:pPr>
-    </w:p>
-    <w:p>
-      <w:pPr>
-        <w:rPr>
-          <w:lang w:val="en-GB"/>
-        </w:rPr>
-      </w:pPr>
-    </w:p>
-    <w:p>
-      <w:pPr>
-        <w:rPr>
-          <w:lang w:val="en-GB"/>
-        </w:rPr>
-      </w:pPr>
     </w:p>
     <w:p>
       <w:pPr>

</xml_diff>